<commit_message>
changes for assigment 2
</commit_message>
<xml_diff>
--- a/docs/CE154_assignment_1.docx
+++ b/docs/CE154_assignment_1.docx
@@ -41,6 +41,58 @@
           <w:u w:val="none"/>
         </w:rPr>
         <w:t>35605</w:t>
+      </w:r>
+    </w:p>
+    <w:p>
+      <w:pPr>
+        <w:rPr>
+          <w:b w:val="1"/>
+          <w:bCs w:val="1"/>
+          <w:sz w:val="24"/>
+          <w:szCs w:val="24"/>
+          <w:u w:val="none"/>
+        </w:rPr>
+      </w:pPr>
+      <w:r>
+        <w:rPr>
+          <w:b w:val="1"/>
+          <w:bCs w:val="1"/>
+          <w:sz w:val="24"/>
+          <w:szCs w:val="24"/>
+          <w:u w:val="none"/>
+        </w:rPr>
+        <w:t>Introduction</w:t>
+      </w:r>
+    </w:p>
+    <w:p>
+      <w:pPr>
+        <w:rPr>
+          <w:b w:val="1"/>
+          <w:bCs w:val="1"/>
+          <w:sz w:val="24"/>
+          <w:szCs w:val="24"/>
+          <w:u w:val="none"/>
+        </w:rPr>
+      </w:pPr>
+      <w:r>
+        <w:rPr>
+          <w:b w:val="1"/>
+          <w:bCs w:val="1"/>
+          <w:sz w:val="24"/>
+          <w:szCs w:val="24"/>
+          <w:u w:val="none"/>
+        </w:rPr>
+        <w:t xml:space="preserve">In this assignment, my task was to create an artist portfolio website that has 5 pages and 5 products. I used </w:t>
+      </w:r>
+      <w:r>
+        <w:rPr>
+          <w:b w:val="1"/>
+          <w:bCs w:val="1"/>
+          <w:sz w:val="24"/>
+          <w:szCs w:val="24"/>
+          <w:u w:val="none"/>
+        </w:rPr>
+        <w:t>other competitors to research and gather inspiration for my own design and layout, to meet the requirements requested.</w:t>
       </w:r>
     </w:p>
     <w:p>
@@ -1606,7 +1658,7 @@
       </w:pPr>
       <w:r>
         <w:drawing>
-          <wp:inline wp14:editId="33BA4E91" wp14:anchorId="51156397">
+          <wp:inline wp14:editId="33A38152" wp14:anchorId="51156397">
             <wp:extent cx="5724525" cy="3209925"/>
             <wp:effectExtent l="0" t="0" r="0" b="0"/>
             <wp:docPr id="958507622" name="drawing"/>
@@ -1676,7 +1728,7 @@
       </w:pPr>
       <w:r>
         <w:drawing>
-          <wp:inline wp14:editId="3453F582" wp14:anchorId="35763573">
+          <wp:inline wp14:editId="0395017E" wp14:anchorId="35763573">
             <wp:extent cx="5724525" cy="3219450"/>
             <wp:effectExtent l="0" t="0" r="0" b="0"/>
             <wp:docPr id="1984234286" name="drawing"/>
@@ -1742,7 +1794,7 @@
       </w:pPr>
       <w:r>
         <w:drawing>
-          <wp:inline wp14:editId="517119A1" wp14:anchorId="621B6567">
+          <wp:inline wp14:editId="3F297D42" wp14:anchorId="621B6567">
             <wp:extent cx="5724525" cy="3209925"/>
             <wp:effectExtent l="0" t="0" r="0" b="0"/>
             <wp:docPr id="1888770746" name="drawing"/>
@@ -1812,7 +1864,7 @@
       </w:pPr>
       <w:r>
         <w:drawing>
-          <wp:inline wp14:editId="6A9019AD" wp14:anchorId="1796BD0B">
+          <wp:inline wp14:editId="4595AB00" wp14:anchorId="1796BD0B">
             <wp:extent cx="5724525" cy="3219450"/>
             <wp:effectExtent l="0" t="0" r="0" b="0"/>
             <wp:docPr id="839259472" name="drawing"/>
@@ -1882,7 +1934,7 @@
       </w:pPr>
       <w:r>
         <w:drawing>
-          <wp:inline wp14:editId="69598716" wp14:anchorId="423864A9">
+          <wp:inline wp14:editId="0476E20C" wp14:anchorId="423864A9">
             <wp:extent cx="5724525" cy="3209925"/>
             <wp:effectExtent l="0" t="0" r="0" b="0"/>
             <wp:docPr id="1838846197" name="drawing"/>
@@ -4564,7 +4616,57 @@
           <w:szCs w:val="24"/>
           <w:u w:val="none"/>
         </w:rPr>
-        <w:t xml:space="preserve"> is easy to use, and is functional.</w:t>
+        <w:t xml:space="preserve"> is easy to use</w:t>
+      </w:r>
+      <w:r>
+        <w:rPr>
+          <w:b w:val="0"/>
+          <w:bCs w:val="0"/>
+          <w:sz w:val="24"/>
+          <w:szCs w:val="24"/>
+          <w:u w:val="none"/>
+        </w:rPr>
+        <w:t xml:space="preserve">. </w:t>
+      </w:r>
+      <w:r>
+        <w:rPr>
+          <w:b w:val="0"/>
+          <w:bCs w:val="0"/>
+          <w:sz w:val="24"/>
+          <w:szCs w:val="24"/>
+          <w:u w:val="none"/>
+        </w:rPr>
+        <w:t>( Not</w:t>
+      </w:r>
+      <w:r>
+        <w:rPr>
+          <w:b w:val="0"/>
+          <w:bCs w:val="0"/>
+          <w:sz w:val="24"/>
+          <w:szCs w:val="24"/>
+          <w:u w:val="none"/>
+        </w:rPr>
+        <w:t xml:space="preserve"> implemented, they are </w:t>
+      </w:r>
+      <w:r>
+        <w:rPr>
+          <w:b w:val="0"/>
+          <w:bCs w:val="0"/>
+          <w:sz w:val="24"/>
+          <w:szCs w:val="24"/>
+          <w:u w:val="none"/>
+        </w:rPr>
+        <w:t xml:space="preserve">talking </w:t>
+      </w:r>
+      <w:r>
+        <w:rPr>
+          <w:b w:val="0"/>
+          <w:bCs w:val="0"/>
+          <w:sz w:val="24"/>
+          <w:szCs w:val="24"/>
+          <w:u w:val="none"/>
+        </w:rPr>
+        <w:t>about the layout)</w:t>
       </w:r>
     </w:p>
     <w:p>

</xml_diff>